<commit_message>
updated missing parts list, checked some part changes, documents in the xsl
</commit_message>
<xml_diff>
--- a/Using Trenz Library/PleaseAdd_Email.docx
+++ b/Using Trenz Library/PleaseAdd_Email.docx
@@ -148,7 +148,7 @@
                 <w:noProof/>
                 <w:lang w:val="de-DE"/>
               </w:rPr>
-              <w:t>Maxim Integrated</w:t>
+              <w:t>Lattice</w:t>
             </w:r>
             <w:r>
               <w:rPr>
@@ -209,7 +209,7 @@
               <w:rPr>
                 <w:noProof/>
               </w:rPr>
-              <w:t>MAX14878AWE+</w:t>
+              <w:t>LC4128V-75TN100C</w:t>
             </w:r>
             <w:r>
               <w:rPr>
@@ -270,7 +270,7 @@
               <w:rPr>
                 <w:noProof/>
               </w:rPr>
-              <w:t>5kV  Isolated CAN Transceivers</w:t>
+              <w:t>CPLD - 400MHZ 128 Macrocell 3.3 V 7.5 tPD</w:t>
             </w:r>
             <w:r>
               <w:rPr>
@@ -312,7 +312,7 @@
               <w:rPr>
                 <w:noProof/>
               </w:rPr>
-              <w:t>Farnell</w:t>
+              <w:t>Mouser</w:t>
             </w:r>
             <w:r>
               <w:rPr>
@@ -349,7 +349,7 @@
               <w:rPr>
                 <w:noProof/>
               </w:rPr>
-              <w:t>2792798</w:t>
+              <w:t>842-4128V75TN100C</w:t>
             </w:r>
             <w:r>
               <w:rPr>
@@ -398,7 +398,7 @@
                 <w:noProof/>
                 <w:lang w:val="de-DE"/>
               </w:rPr>
-              <w:t>Mouser</w:t>
+              <w:t>Digi-Key</w:t>
             </w:r>
             <w:r>
               <w:rPr>
@@ -442,7 +442,7 @@
                 <w:noProof/>
                 <w:lang w:val="de-DE"/>
               </w:rPr>
-              <w:t>700-MAX14878AWE+</w:t>
+              <w:t>220-1044-ND</w:t>
             </w:r>
             <w:r>
               <w:rPr>
@@ -484,19 +484,6 @@
               <w:rPr>
                 <w:lang w:val="de-DE"/>
               </w:rPr>
-              <w:fldChar w:fldCharType="separate"/>
-            </w:r>
-            <w:r>
-              <w:rPr>
-                <w:noProof/>
-                <w:lang w:val="de-DE"/>
-              </w:rPr>
-              <w:t>Digi-Key</w:t>
-            </w:r>
-            <w:r>
-              <w:rPr>
-                <w:lang w:val="de-DE"/>
-              </w:rPr>
               <w:fldChar w:fldCharType="end"/>
             </w:r>
           </w:p>
@@ -522,18 +509,6 @@
               <w:rPr>
                 <w:lang w:val="de-DE"/>
               </w:rPr>
-              <w:fldChar w:fldCharType="separate"/>
-            </w:r>
-            <w:r>
-              <w:rPr>
-                <w:noProof/>
-              </w:rPr>
-              <w:t>MAX14878AWE+-ND</w:t>
-            </w:r>
-            <w:r>
-              <w:rPr>
-                <w:lang w:val="de-DE"/>
-              </w:rPr>
               <w:fldChar w:fldCharType="end"/>
             </w:r>
           </w:p>
@@ -544,20 +519,6 @@
       <w:pPr>
         <w:pStyle w:val="NurText"/>
       </w:pPr>
-    </w:p>
-    <w:p>
-      <w:pPr>
-        <w:pStyle w:val="NurText"/>
-        <w:rPr>
-          <w:lang w:val="de-DE"/>
-        </w:rPr>
-      </w:pPr>
-      <w:r>
-        <w:rPr>
-          <w:lang w:val="de-DE"/>
-        </w:rPr>
-        <w:t xml:space="preserve">Falls gewünscht, kann ich gerne Footprint und Schematic zur Verfügung stellen. </w:t>
-      </w:r>
     </w:p>
     <w:p>
       <w:pPr>
@@ -616,71 +577,19 @@
 <wne:recipients xmlns:wpc="http://schemas.microsoft.com/office/word/2010/wordprocessingCanvas" xmlns:mc="http://schemas.openxmlformats.org/markup-compatibility/2006" xmlns:o="urn:schemas-microsoft-com:office:office" xmlns:r="http://schemas.openxmlformats.org/officeDocument/2006/relationships" xmlns:m="http://schemas.openxmlformats.org/officeDocument/2006/math" xmlns:v="urn:schemas-microsoft-com:vml" xmlns:wp14="http://schemas.microsoft.com/office/word/2010/wordprocessingDrawing" xmlns:wp="http://schemas.openxmlformats.org/drawingml/2006/wordprocessingDrawing" xmlns:w10="urn:schemas-microsoft-com:office:word" xmlns:w="http://schemas.openxmlformats.org/wordprocessingml/2006/main" xmlns:w14="http://schemas.microsoft.com/office/word/2010/wordml" xmlns:w15="http://schemas.microsoft.com/office/word/2012/wordml" xmlns:wpg="http://schemas.microsoft.com/office/word/2010/wordprocessingGroup" xmlns:wpi="http://schemas.microsoft.com/office/word/2010/wordprocessingInk" xmlns:wne="http://schemas.microsoft.com/office/word/2006/wordml" xmlns:wps="http://schemas.microsoft.com/office/word/2010/wordprocessingShape" mc:Ignorable="w14 w15 wp14">
   <wne:recipientData>
     <wne:active wne:val="1"/>
-    <wne:hash wne:val="968740872"/>
+    <wne:hash wne:val="-1764450784"/>
   </wne:recipientData>
   <wne:recipientData>
     <wne:active wne:val="1"/>
-    <wne:hash wne:val="-915134903"/>
+    <wne:hash wne:val="28606938"/>
   </wne:recipientData>
   <wne:recipientData>
     <wne:active wne:val="1"/>
-    <wne:hash wne:val="1428354437"/>
+    <wne:hash wne:val="281418852"/>
   </wne:recipientData>
   <wne:recipientData>
     <wne:active wne:val="1"/>
-    <wne:hash wne:val="-433058505"/>
-  </wne:recipientData>
-  <wne:recipientData>
-    <wne:active wne:val="1"/>
-    <wne:hash wne:val="798795429"/>
-  </wne:recipientData>
-  <wne:recipientData>
-    <wne:active wne:val="1"/>
-    <wne:hash wne:val="-1955597133"/>
-  </wne:recipientData>
-  <wne:recipientData>
-    <wne:active wne:val="1"/>
-    <wne:hash wne:val="-347692678"/>
-  </wne:recipientData>
-  <wne:recipientData>
-    <wne:active wne:val="1"/>
-    <wne:hash wne:val="848159931"/>
-  </wne:recipientData>
-  <wne:recipientData>
-    <wne:active wne:val="1"/>
-    <wne:hash wne:val="-1054805556"/>
-  </wne:recipientData>
-  <wne:recipientData>
-    <wne:active wne:val="1"/>
-    <wne:hash wne:val="779299375"/>
-  </wne:recipientData>
-  <wne:recipientData>
-    <wne:active wne:val="1"/>
-    <wne:hash wne:val="588754480"/>
-  </wne:recipientData>
-  <wne:recipientData>
-    <wne:active wne:val="1"/>
-    <wne:hash wne:val="-2033373446"/>
-  </wne:recipientData>
-  <wne:recipientData>
-    <wne:active wne:val="1"/>
-    <wne:hash wne:val="-2058694129"/>
-  </wne:recipientData>
-  <wne:recipientData>
-    <wne:active wne:val="1"/>
-    <wne:hash wne:val="-1039162188"/>
-  </wne:recipientData>
-  <wne:recipientData>
-    <wne:active wne:val="1"/>
-    <wne:hash wne:val="-2124145258"/>
-  </wne:recipientData>
-  <wne:recipientData>
-    <wne:active wne:val="1"/>
-    <wne:hash wne:val="1188799859"/>
-  </wne:recipientData>
-  <wne:recipientData>
-    <wne:active wne:val="1"/>
-    <wne:hash wne:val="388560735"/>
+    <wne:hash wne:val="451679449"/>
   </wne:recipientData>
 </wne:recipients>
 </file>

</xml_diff>